<commit_message>
Ajouter les légendes FR-EN sous chaque photo
Co-authored-by: arena-agent <297053741+arena-agent@users.noreply.github.com>
</commit_message>
<xml_diff>
--- a/Pièces jointes.docx
+++ b/Pièces jointes.docx
@@ -9,7 +9,7 @@
       <w:r>
         <w:drawing>
           <wp:inline xmlns:a="http://schemas.openxmlformats.org/drawingml/2006/main" xmlns:pic="http://schemas.openxmlformats.org/drawingml/2006/picture">
-            <wp:extent cx="5580000" cy="7440000"/>
+            <wp:extent cx="5472000" cy="7296000"/>
             <wp:docPr id="1" name="Picture 1"/>
             <wp:cNvGraphicFramePr>
               <a:graphicFrameLocks noChangeAspect="1"/>
@@ -30,7 +30,7 @@
                   <pic:spPr>
                     <a:xfrm>
                       <a:off x="0" y="0"/>
-                      <a:ext cx="5580000" cy="7440000"/>
+                      <a:ext cx="5472000" cy="7296000"/>
                     </a:xfrm>
                     <a:prstGeom prst="rect"/>
                   </pic:spPr>
@@ -39,6 +39,41 @@
             </a:graphic>
           </wp:inline>
         </w:drawing>
+      </w:r>
+    </w:p>
+    <w:p>
+      <w:pPr>
+        <w:spacing w:before="160" w:after="40"/>
+        <w:jc w:val="center"/>
+      </w:pPr>
+      <w:r>
+        <w:rPr>
+          <w:b/>
+          <w:sz w:val="22"/>
+        </w:rPr>
+        <w:t xml:space="preserve">Photo 1. </w:t>
+      </w:r>
+      <w:r>
+        <w:rPr>
+          <w:sz w:val="22"/>
+        </w:rPr>
+        <w:t>Séance d’éducation à l’hygiène hydro-fécale et alimentaire : des femmes consultent les fiches-conseils, avec le matériel de démonstration du lavage des mains au premier plan (Sô-Ava, 2026).</w:t>
+      </w:r>
+    </w:p>
+    <w:p>
+      <w:pPr>
+        <w:spacing w:before="0" w:after="0"/>
+        <w:jc w:val="center"/>
+      </w:pPr>
+      <w:r>
+        <w:rPr>
+          <w:i/>
+          <w:color w:val="595959"/>
+          <w:sz w:val="20"/>
+        </w:rPr>
+        <w:t>Fecal-oral and food hygiene education session: women reviewing the household advice sheets, with handwashing demonstration materials in the foreground (Sô-Ava, 2026).</w:t>
+      </w:r>
+      <w:r>
         <w:br w:type="page"/>
       </w:r>
     </w:p>
@@ -49,7 +84,7 @@
       <w:r>
         <w:drawing>
           <wp:inline xmlns:a="http://schemas.openxmlformats.org/drawingml/2006/main" xmlns:pic="http://schemas.openxmlformats.org/drawingml/2006/picture">
-            <wp:extent cx="5580000" cy="7440000"/>
+            <wp:extent cx="5472000" cy="7296000"/>
             <wp:docPr id="2" name="Picture 2"/>
             <wp:cNvGraphicFramePr>
               <a:graphicFrameLocks noChangeAspect="1"/>
@@ -70,7 +105,7 @@
                   <pic:spPr>
                     <a:xfrm>
                       <a:off x="0" y="0"/>
-                      <a:ext cx="5580000" cy="7440000"/>
+                      <a:ext cx="5472000" cy="7296000"/>
                     </a:xfrm>
                     <a:prstGeom prst="rect"/>
                   </pic:spPr>
@@ -79,6 +114,41 @@
             </a:graphic>
           </wp:inline>
         </w:drawing>
+      </w:r>
+    </w:p>
+    <w:p>
+      <w:pPr>
+        <w:spacing w:before="160" w:after="40"/>
+        <w:jc w:val="center"/>
+      </w:pPr>
+      <w:r>
+        <w:rPr>
+          <w:b/>
+          <w:sz w:val="22"/>
+        </w:rPr>
+        <w:t xml:space="preserve">Photo 2. </w:t>
+      </w:r>
+      <w:r>
+        <w:rPr>
+          <w:sz w:val="22"/>
+        </w:rPr>
+        <w:t>Séance d’éducation : une participante consulte un support pédagogique visuel sur tablette pendant que d’autres femmes lisent les fiches-conseils, dans un habitat lacustre (Sô-Ava, 2026).</w:t>
+      </w:r>
+    </w:p>
+    <w:p>
+      <w:pPr>
+        <w:spacing w:before="0" w:after="0"/>
+        <w:jc w:val="center"/>
+      </w:pPr>
+      <w:r>
+        <w:rPr>
+          <w:i/>
+          <w:color w:val="595959"/>
+          <w:sz w:val="20"/>
+        </w:rPr>
+        <w:t>Education session: a participant viewing a visual teaching aid on a tablet while other women read the advice sheets, in a lakeside dwelling (Sô-Ava, 2026).</w:t>
+      </w:r>
+      <w:r>
         <w:br w:type="page"/>
       </w:r>
     </w:p>
@@ -89,7 +159,7 @@
       <w:r>
         <w:drawing>
           <wp:inline xmlns:a="http://schemas.openxmlformats.org/drawingml/2006/main" xmlns:pic="http://schemas.openxmlformats.org/drawingml/2006/picture">
-            <wp:extent cx="5580000" cy="7440000"/>
+            <wp:extent cx="5472000" cy="7296000"/>
             <wp:docPr id="3" name="Picture 3"/>
             <wp:cNvGraphicFramePr>
               <a:graphicFrameLocks noChangeAspect="1"/>
@@ -110,7 +180,7 @@
                   <pic:spPr>
                     <a:xfrm>
                       <a:off x="0" y="0"/>
-                      <a:ext cx="5580000" cy="7440000"/>
+                      <a:ext cx="5472000" cy="7296000"/>
                     </a:xfrm>
                     <a:prstGeom prst="rect"/>
                   </pic:spPr>
@@ -119,6 +189,41 @@
             </a:graphic>
           </wp:inline>
         </w:drawing>
+      </w:r>
+    </w:p>
+    <w:p>
+      <w:pPr>
+        <w:spacing w:before="160" w:after="40"/>
+        <w:jc w:val="center"/>
+      </w:pPr>
+      <w:r>
+        <w:rPr>
+          <w:b/>
+          <w:sz w:val="22"/>
+        </w:rPr>
+        <w:t xml:space="preserve">Photo 3. </w:t>
+      </w:r>
+      <w:r>
+        <w:rPr>
+          <w:sz w:val="22"/>
+        </w:rPr>
+        <w:t>Discussion participative pendant une séance d’éducation à l’hygiène, autour des fiches-conseils pour les ménages et d’un support visuel (Sô-Ava, 2026).</w:t>
+      </w:r>
+    </w:p>
+    <w:p>
+      <w:pPr>
+        <w:spacing w:before="0" w:after="0"/>
+        <w:jc w:val="center"/>
+      </w:pPr>
+      <w:r>
+        <w:rPr>
+          <w:i/>
+          <w:color w:val="595959"/>
+          <w:sz w:val="20"/>
+        </w:rPr>
+        <w:t>Participatory discussion during a hygiene education session, around the household advice sheets and a visual aid (Sô-Ava, 2026).</w:t>
+      </w:r>
+      <w:r>
         <w:br w:type="page"/>
       </w:r>
     </w:p>
@@ -129,7 +234,7 @@
       <w:r>
         <w:drawing>
           <wp:inline xmlns:a="http://schemas.openxmlformats.org/drawingml/2006/main" xmlns:pic="http://schemas.openxmlformats.org/drawingml/2006/picture">
-            <wp:extent cx="5580000" cy="7440000"/>
+            <wp:extent cx="5472000" cy="7296000"/>
             <wp:docPr id="4" name="Picture 4"/>
             <wp:cNvGraphicFramePr>
               <a:graphicFrameLocks noChangeAspect="1"/>
@@ -150,7 +255,7 @@
                   <pic:spPr>
                     <a:xfrm>
                       <a:off x="0" y="0"/>
-                      <a:ext cx="5580000" cy="7440000"/>
+                      <a:ext cx="5472000" cy="7296000"/>
                     </a:xfrm>
                     <a:prstGeom prst="rect"/>
                   </pic:spPr>
@@ -159,6 +264,41 @@
             </a:graphic>
           </wp:inline>
         </w:drawing>
+      </w:r>
+    </w:p>
+    <w:p>
+      <w:pPr>
+        <w:spacing w:before="160" w:after="40"/>
+        <w:jc w:val="center"/>
+      </w:pPr>
+      <w:r>
+        <w:rPr>
+          <w:b/>
+          <w:sz w:val="22"/>
+        </w:rPr>
+        <w:t xml:space="preserve">Photo 4. </w:t>
+      </w:r>
+      <w:r>
+        <w:rPr>
+          <w:sz w:val="22"/>
+        </w:rPr>
+        <w:t>Échanges entre participantes autour des messages d’hygiène hydro-fécale et alimentaire pendant une séance d’éducation (Sô-Ava, 2026).</w:t>
+      </w:r>
+    </w:p>
+    <w:p>
+      <w:pPr>
+        <w:spacing w:before="0" w:after="0"/>
+        <w:jc w:val="center"/>
+      </w:pPr>
+      <w:r>
+        <w:rPr>
+          <w:i/>
+          <w:color w:val="595959"/>
+          <w:sz w:val="20"/>
+        </w:rPr>
+        <w:t>Participants discussing fecal-oral and food hygiene messages during an education session (Sô-Ava, 2026).</w:t>
+      </w:r>
+      <w:r>
         <w:br w:type="page"/>
       </w:r>
     </w:p>
@@ -169,7 +309,7 @@
       <w:r>
         <w:drawing>
           <wp:inline xmlns:a="http://schemas.openxmlformats.org/drawingml/2006/main" xmlns:pic="http://schemas.openxmlformats.org/drawingml/2006/picture">
-            <wp:extent cx="5580000" cy="7443961"/>
+            <wp:extent cx="5472000" cy="7299884"/>
             <wp:docPr id="5" name="Picture 5"/>
             <wp:cNvGraphicFramePr>
               <a:graphicFrameLocks noChangeAspect="1"/>
@@ -190,7 +330,7 @@
                   <pic:spPr>
                     <a:xfrm>
                       <a:off x="0" y="0"/>
-                      <a:ext cx="5580000" cy="7443961"/>
+                      <a:ext cx="5472000" cy="7299884"/>
                     </a:xfrm>
                     <a:prstGeom prst="rect"/>
                   </pic:spPr>
@@ -199,6 +339,41 @@
             </a:graphic>
           </wp:inline>
         </w:drawing>
+      </w:r>
+    </w:p>
+    <w:p>
+      <w:pPr>
+        <w:spacing w:before="160" w:after="40"/>
+        <w:jc w:val="center"/>
+      </w:pPr>
+      <w:r>
+        <w:rPr>
+          <w:b/>
+          <w:sz w:val="22"/>
+        </w:rPr>
+        <w:t xml:space="preserve">Photo 5. </w:t>
+      </w:r>
+      <w:r>
+        <w:rPr>
+          <w:sz w:val="22"/>
+        </w:rPr>
+        <w:t>Groupe de femmes réunies pour une séance d’éducation à l’hygiène hydro-fécale et alimentaire dans un habitat lacustre (Sô-Ava, 2026).</w:t>
+      </w:r>
+    </w:p>
+    <w:p>
+      <w:pPr>
+        <w:spacing w:before="0" w:after="0"/>
+        <w:jc w:val="center"/>
+      </w:pPr>
+      <w:r>
+        <w:rPr>
+          <w:i/>
+          <w:color w:val="595959"/>
+          <w:sz w:val="20"/>
+        </w:rPr>
+        <w:t>Group of women gathered for a fecal-oral and food hygiene education session in a lakeside dwelling (Sô-Ava, 2026).</w:t>
+      </w:r>
+      <w:r>
         <w:br w:type="page"/>
       </w:r>
     </w:p>
@@ -209,7 +384,7 @@
       <w:r>
         <w:drawing>
           <wp:inline xmlns:a="http://schemas.openxmlformats.org/drawingml/2006/main" xmlns:pic="http://schemas.openxmlformats.org/drawingml/2006/picture">
-            <wp:extent cx="5580000" cy="7447984"/>
+            <wp:extent cx="5472000" cy="7303830"/>
             <wp:docPr id="6" name="Picture 6"/>
             <wp:cNvGraphicFramePr>
               <a:graphicFrameLocks noChangeAspect="1"/>
@@ -230,7 +405,7 @@
                   <pic:spPr>
                     <a:xfrm>
                       <a:off x="0" y="0"/>
-                      <a:ext cx="5580000" cy="7447984"/>
+                      <a:ext cx="5472000" cy="7303830"/>
                     </a:xfrm>
                     <a:prstGeom prst="rect"/>
                   </pic:spPr>
@@ -239,6 +414,41 @@
             </a:graphic>
           </wp:inline>
         </w:drawing>
+      </w:r>
+    </w:p>
+    <w:p>
+      <w:pPr>
+        <w:spacing w:before="160" w:after="40"/>
+        <w:jc w:val="center"/>
+      </w:pPr>
+      <w:r>
+        <w:rPr>
+          <w:b/>
+          <w:sz w:val="22"/>
+        </w:rPr>
+        <w:t xml:space="preserve">Photo 6. </w:t>
+      </w:r>
+      <w:r>
+        <w:rPr>
+          <w:sz w:val="22"/>
+        </w:rPr>
+        <w:t>Observation des conditions d’hygiène : aliments conservés dans des récipients couverts sur un point de préparation/vente (Sô-Ava, 2026).</w:t>
+      </w:r>
+    </w:p>
+    <w:p>
+      <w:pPr>
+        <w:spacing w:before="0" w:after="0"/>
+        <w:jc w:val="center"/>
+      </w:pPr>
+      <w:r>
+        <w:rPr>
+          <w:i/>
+          <w:color w:val="595959"/>
+          <w:sz w:val="20"/>
+        </w:rPr>
+        <w:t>Observation of hygiene conditions: food stored in covered containers at a food preparation/selling point (Sô-Ava, 2026).</w:t>
+      </w:r>
+      <w:r>
         <w:br w:type="page"/>
       </w:r>
     </w:p>
@@ -249,7 +459,7 @@
       <w:r>
         <w:drawing>
           <wp:inline xmlns:a="http://schemas.openxmlformats.org/drawingml/2006/main" xmlns:pic="http://schemas.openxmlformats.org/drawingml/2006/picture">
-            <wp:extent cx="5580000" cy="7448087"/>
+            <wp:extent cx="5472000" cy="7303931"/>
             <wp:docPr id="7" name="Picture 7"/>
             <wp:cNvGraphicFramePr>
               <a:graphicFrameLocks noChangeAspect="1"/>
@@ -270,7 +480,7 @@
                   <pic:spPr>
                     <a:xfrm>
                       <a:off x="0" y="0"/>
-                      <a:ext cx="5580000" cy="7448087"/>
+                      <a:ext cx="5472000" cy="7303931"/>
                     </a:xfrm>
                     <a:prstGeom prst="rect"/>
                   </pic:spPr>
@@ -279,6 +489,41 @@
             </a:graphic>
           </wp:inline>
         </w:drawing>
+      </w:r>
+    </w:p>
+    <w:p>
+      <w:pPr>
+        <w:spacing w:before="160" w:after="40"/>
+        <w:jc w:val="center"/>
+      </w:pPr>
+      <w:r>
+        <w:rPr>
+          <w:b/>
+          <w:sz w:val="22"/>
+        </w:rPr>
+        <w:t xml:space="preserve">Photo 7. </w:t>
+      </w:r>
+      <w:r>
+        <w:rPr>
+          <w:sz w:val="22"/>
+        </w:rPr>
+        <w:t>Observation dans un ménage : ustensiles et aliments couverts et protégés dans un habitat sur pilotis (Sô-Ava, 2026).</w:t>
+      </w:r>
+    </w:p>
+    <w:p>
+      <w:pPr>
+        <w:spacing w:before="0" w:after="0"/>
+        <w:jc w:val="center"/>
+      </w:pPr>
+      <w:r>
+        <w:rPr>
+          <w:i/>
+          <w:color w:val="595959"/>
+          <w:sz w:val="20"/>
+        </w:rPr>
+        <w:t>Household observation: covered and protected utensils and food in a stilt dwelling (Sô-Ava, 2026).</w:t>
+      </w:r>
+      <w:r>
         <w:br w:type="page"/>
       </w:r>
     </w:p>
@@ -289,7 +534,7 @@
       <w:r>
         <w:drawing>
           <wp:inline xmlns:a="http://schemas.openxmlformats.org/drawingml/2006/main" xmlns:pic="http://schemas.openxmlformats.org/drawingml/2006/picture">
-            <wp:extent cx="5580000" cy="7440000"/>
+            <wp:extent cx="5472000" cy="7296000"/>
             <wp:docPr id="8" name="Picture 8"/>
             <wp:cNvGraphicFramePr>
               <a:graphicFrameLocks noChangeAspect="1"/>
@@ -310,7 +555,7 @@
                   <pic:spPr>
                     <a:xfrm>
                       <a:off x="0" y="0"/>
-                      <a:ext cx="5580000" cy="7440000"/>
+                      <a:ext cx="5472000" cy="7296000"/>
                     </a:xfrm>
                     <a:prstGeom prst="rect"/>
                   </pic:spPr>
@@ -319,6 +564,41 @@
             </a:graphic>
           </wp:inline>
         </w:drawing>
+      </w:r>
+    </w:p>
+    <w:p>
+      <w:pPr>
+        <w:spacing w:before="160" w:after="40"/>
+        <w:jc w:val="center"/>
+      </w:pPr>
+      <w:r>
+        <w:rPr>
+          <w:b/>
+          <w:sz w:val="22"/>
+        </w:rPr>
+        <w:t xml:space="preserve">Photo 8. </w:t>
+      </w:r>
+      <w:r>
+        <w:rPr>
+          <w:sz w:val="22"/>
+        </w:rPr>
+        <w:t>Observation d’un point de vente de repas : récipients couverts et environnement de vente (Sô-Ava, 2026).</w:t>
+      </w:r>
+    </w:p>
+    <w:p>
+      <w:pPr>
+        <w:spacing w:before="0" w:after="0"/>
+        <w:jc w:val="center"/>
+      </w:pPr>
+      <w:r>
+        <w:rPr>
+          <w:i/>
+          <w:color w:val="595959"/>
+          <w:sz w:val="20"/>
+        </w:rPr>
+        <w:t>Observation of a cooked-food selling point: covered containers and selling environment (Sô-Ava, 2026).</w:t>
+      </w:r>
+      <w:r>
         <w:br w:type="page"/>
       </w:r>
     </w:p>
@@ -329,7 +609,7 @@
       <w:r>
         <w:drawing>
           <wp:inline xmlns:a="http://schemas.openxmlformats.org/drawingml/2006/main" xmlns:pic="http://schemas.openxmlformats.org/drawingml/2006/picture">
-            <wp:extent cx="5580000" cy="7440000"/>
+            <wp:extent cx="5472000" cy="7296000"/>
             <wp:docPr id="9" name="Picture 9"/>
             <wp:cNvGraphicFramePr>
               <a:graphicFrameLocks noChangeAspect="1"/>
@@ -350,7 +630,7 @@
                   <pic:spPr>
                     <a:xfrm>
                       <a:off x="0" y="0"/>
-                      <a:ext cx="5580000" cy="7440000"/>
+                      <a:ext cx="5472000" cy="7296000"/>
                     </a:xfrm>
                     <a:prstGeom prst="rect"/>
                   </pic:spPr>
@@ -359,6 +639,41 @@
             </a:graphic>
           </wp:inline>
         </w:drawing>
+      </w:r>
+    </w:p>
+    <w:p>
+      <w:pPr>
+        <w:spacing w:before="160" w:after="40"/>
+        <w:jc w:val="center"/>
+      </w:pPr>
+      <w:r>
+        <w:rPr>
+          <w:b/>
+          <w:sz w:val="22"/>
+        </w:rPr>
+        <w:t xml:space="preserve">Photo 9. </w:t>
+      </w:r>
+      <w:r>
+        <w:rPr>
+          <w:sz w:val="22"/>
+        </w:rPr>
+        <w:t>Démonstration et échanges sur les pratiques d’hygiène hydro-fécale et alimentaire avec des femmes, en extérieur (Sô-Ava, 2026).</w:t>
+      </w:r>
+    </w:p>
+    <w:p>
+      <w:pPr>
+        <w:spacing w:before="0" w:after="0"/>
+        <w:jc w:val="center"/>
+      </w:pPr>
+      <w:r>
+        <w:rPr>
+          <w:i/>
+          <w:color w:val="595959"/>
+          <w:sz w:val="20"/>
+        </w:rPr>
+        <w:t>Outdoor demonstration and discussion of fecal-oral and food hygiene practices with women (Sô-Ava, 2026).</w:t>
+      </w:r>
+      <w:r>
         <w:br w:type="page"/>
       </w:r>
     </w:p>
@@ -369,7 +684,7 @@
       <w:r>
         <w:drawing>
           <wp:inline xmlns:a="http://schemas.openxmlformats.org/drawingml/2006/main" xmlns:pic="http://schemas.openxmlformats.org/drawingml/2006/picture">
-            <wp:extent cx="5580000" cy="7440001"/>
+            <wp:extent cx="5472000" cy="7296001"/>
             <wp:docPr id="10" name="Picture 10"/>
             <wp:cNvGraphicFramePr>
               <a:graphicFrameLocks noChangeAspect="1"/>
@@ -390,7 +705,7 @@
                   <pic:spPr>
                     <a:xfrm>
                       <a:off x="0" y="0"/>
-                      <a:ext cx="5580000" cy="7440001"/>
+                      <a:ext cx="5472000" cy="7296001"/>
                     </a:xfrm>
                     <a:prstGeom prst="rect"/>
                   </pic:spPr>
@@ -399,6 +714,39 @@
             </a:graphic>
           </wp:inline>
         </w:drawing>
+      </w:r>
+    </w:p>
+    <w:p>
+      <w:pPr>
+        <w:spacing w:before="160" w:after="40"/>
+        <w:jc w:val="center"/>
+      </w:pPr>
+      <w:r>
+        <w:rPr>
+          <w:b/>
+          <w:sz w:val="22"/>
+        </w:rPr>
+        <w:t xml:space="preserve">Photo 10. </w:t>
+      </w:r>
+      <w:r>
+        <w:rPr>
+          <w:sz w:val="22"/>
+        </w:rPr>
+        <w:t>Observation auprès d’une vendeuse : récipients couverts et eau disponible pour les usages d’hygiène (Sô-Ava, 2026).</w:t>
+      </w:r>
+    </w:p>
+    <w:p>
+      <w:pPr>
+        <w:spacing w:before="0" w:after="0"/>
+        <w:jc w:val="center"/>
+      </w:pPr>
+      <w:r>
+        <w:rPr>
+          <w:i/>
+          <w:color w:val="595959"/>
+          <w:sz w:val="20"/>
+        </w:rPr>
+        <w:t>Observation with a food seller: covered containers and water available for hygiene uses (Sô-Ava, 2026).</w:t>
       </w:r>
     </w:p>
     <w:sectPr>
@@ -777,6 +1125,10 @@
     <w:pPr>
       <w:spacing w:before="0" w:after="0"/>
     </w:pPr>
+    <w:rPr>
+      <w:rFonts w:ascii="Calibri" w:hAnsi="Calibri"/>
+      <w:sz w:val="22"/>
+    </w:rPr>
   </w:style>
   <w:style w:type="paragraph" w:styleId="Header">
     <w:name w:val="header"/>

</xml_diff>